<commit_message>
Update in working procedure
</commit_message>
<xml_diff>
--- a/SEM_7/PRPWA/Project/Working Procedure.docx
+++ b/SEM_7/PRPWA/Project/Working Procedure.docx
@@ -138,7 +138,24 @@
                   </w14:solidFill>
                 </w14:textFill>
               </w:rPr>
-              <w:t>Section - 241026</w:t>
+              <w:t>Section - 2</w:t>
+            </w:r>
+            <w:bookmarkStart w:id="0" w:name="_GoBack"/>
+            <w:bookmarkEnd w:id="0"/>
+            <w:r>
+              <w:rPr>
+                <w:rFonts w:hint="default" w:ascii="Times New Roman Bold" w:hAnsi="Times New Roman Bold" w:cs="Times New Roman Bold"/>
+                <w:b/>
+                <w:bCs/>
+                <w:color w:val="000000" w:themeColor="text1"/>
+                <w:lang w:val="en-US"/>
+                <w14:textFill>
+                  <w14:solidFill>
+                    <w14:schemeClr w14:val="tx1"/>
+                  </w14:solidFill>
+                </w14:textFill>
+              </w:rPr>
+              <w:t>241026</w:t>
             </w:r>
           </w:p>
         </w:tc>
@@ -2622,8 +2639,6 @@
         </w:rPr>
         <w:t xml:space="preserve">Select AUTO or MANUAL on app/web page. ESP sends serial command to Arduino. Arduino switches operation mode. </w:t>
       </w:r>
-      <w:bookmarkStart w:id="0" w:name="_GoBack"/>
-      <w:bookmarkEnd w:id="0"/>
     </w:p>
     <w:p>
       <w:pPr>

</xml_diff>